<commit_message>
add docs generated in app notes
</commit_message>
<xml_diff>
--- a/media/generated_docs/defect_statement_5.docx
+++ b/media/generated_docs/defect_statement_5.docx
@@ -29,19 +29,21 @@
       <w:tblPr>
         <w:tblStyle w:val="TableGrid"/>
         <w:tblW w:type="auto" w:w="0"/>
+        <w:tblLayout w:type="fixed"/>
         <w:tblLook w:firstColumn="1" w:firstRow="1" w:lastColumn="0" w:lastRow="0" w:noHBand="0" w:noVBand="1" w:val="04A0"/>
       </w:tblPr>
       <w:tblGrid>
-        <w:gridCol w:w="1728"/>
-        <w:gridCol w:w="1728"/>
-        <w:gridCol w:w="1728"/>
-        <w:gridCol w:w="1728"/>
-        <w:gridCol w:w="1728"/>
+        <w:gridCol w:w="850"/>
+        <w:gridCol w:w="1984"/>
+        <w:gridCol w:w="2835"/>
+        <w:gridCol w:w="2268"/>
+        <w:gridCol w:w="1134"/>
+        <w:gridCol w:w="1417"/>
       </w:tblGrid>
       <w:tr>
         <w:tc>
           <w:tcPr>
-            <w:tcW w:type="dxa" w:w="1728"/>
+            <w:tcW w:type="dxa" w:w="1440"/>
           </w:tcPr>
           <w:p>
             <w:r>
@@ -54,7 +56,20 @@
         </w:tc>
         <w:tc>
           <w:tcPr>
-            <w:tcW w:type="dxa" w:w="1728"/>
+            <w:tcW w:type="dxa" w:w="1440"/>
+          </w:tcPr>
+          <w:p>
+            <w:r>
+              <w:rPr>
+                <w:b/>
+              </w:rPr>
+              <w:t>Фото дефекта</w:t>
+            </w:r>
+          </w:p>
+        </w:tc>
+        <w:tc>
+          <w:tcPr>
+            <w:tcW w:type="dxa" w:w="1440"/>
           </w:tcPr>
           <w:p>
             <w:r>
@@ -67,7 +82,7 @@
         </w:tc>
         <w:tc>
           <w:tcPr>
-            <w:tcW w:type="dxa" w:w="1728"/>
+            <w:tcW w:type="dxa" w:w="1440"/>
           </w:tcPr>
           <w:p>
             <w:r>
@@ -80,7 +95,7 @@
         </w:tc>
         <w:tc>
           <w:tcPr>
-            <w:tcW w:type="dxa" w:w="1728"/>
+            <w:tcW w:type="dxa" w:w="1440"/>
           </w:tcPr>
           <w:p>
             <w:r>
@@ -93,7 +108,7 @@
         </w:tc>
         <w:tc>
           <w:tcPr>
-            <w:tcW w:type="dxa" w:w="1728"/>
+            <w:tcW w:type="dxa" w:w="1440"/>
           </w:tcPr>
           <w:p>
             <w:r>
@@ -108,7 +123,7 @@
       <w:tr>
         <w:tc>
           <w:tcPr>
-            <w:tcW w:type="dxa" w:w="1728"/>
+            <w:tcW w:type="dxa" w:w="850"/>
           </w:tcPr>
           <w:p>
             <w:r>
@@ -118,7 +133,15 @@
         </w:tc>
         <w:tc>
           <w:tcPr>
-            <w:tcW w:type="dxa" w:w="1728"/>
+            <w:tcW w:type="dxa" w:w="1984"/>
+          </w:tcPr>
+          <w:p>
+            <w:r/>
+          </w:p>
+        </w:tc>
+        <w:tc>
+          <w:tcPr>
+            <w:tcW w:type="dxa" w:w="2835"/>
           </w:tcPr>
           <w:p>
             <w:r>
@@ -128,7 +151,7 @@
         </w:tc>
         <w:tc>
           <w:tcPr>
-            <w:tcW w:type="dxa" w:w="1728"/>
+            <w:tcW w:type="dxa" w:w="2268"/>
           </w:tcPr>
           <w:p>
             <w:r>
@@ -138,7 +161,7 @@
         </w:tc>
         <w:tc>
           <w:tcPr>
-            <w:tcW w:type="dxa" w:w="1728"/>
+            <w:tcW w:type="dxa" w:w="1134"/>
           </w:tcPr>
           <w:p>
             <w:r>
@@ -148,7 +171,7 @@
         </w:tc>
         <w:tc>
           <w:tcPr>
-            <w:tcW w:type="dxa" w:w="1728"/>
+            <w:tcW w:type="dxa" w:w="1417"/>
           </w:tcPr>
           <w:p>
             <w:r>
@@ -160,7 +183,7 @@
       <w:tr>
         <w:tc>
           <w:tcPr>
-            <w:tcW w:type="dxa" w:w="1728"/>
+            <w:tcW w:type="dxa" w:w="850"/>
           </w:tcPr>
           <w:p>
             <w:r>
@@ -170,7 +193,15 @@
         </w:tc>
         <w:tc>
           <w:tcPr>
-            <w:tcW w:type="dxa" w:w="1728"/>
+            <w:tcW w:type="dxa" w:w="1984"/>
+          </w:tcPr>
+          <w:p>
+            <w:r/>
+          </w:p>
+        </w:tc>
+        <w:tc>
+          <w:tcPr>
+            <w:tcW w:type="dxa" w:w="2835"/>
           </w:tcPr>
           <w:p>
             <w:r>
@@ -180,7 +211,7 @@
         </w:tc>
         <w:tc>
           <w:tcPr>
-            <w:tcW w:type="dxa" w:w="1728"/>
+            <w:tcW w:type="dxa" w:w="2268"/>
           </w:tcPr>
           <w:p>
             <w:r>
@@ -190,7 +221,7 @@
         </w:tc>
         <w:tc>
           <w:tcPr>
-            <w:tcW w:type="dxa" w:w="1728"/>
+            <w:tcW w:type="dxa" w:w="1134"/>
           </w:tcPr>
           <w:p>
             <w:r>
@@ -200,7 +231,7 @@
         </w:tc>
         <w:tc>
           <w:tcPr>
-            <w:tcW w:type="dxa" w:w="1728"/>
+            <w:tcW w:type="dxa" w:w="1417"/>
           </w:tcPr>
           <w:p>
             <w:r>

</xml_diff>